<commit_message>
Audit corrections: AUC table, variance-ratio argument, Finding 5 gene claims, COADREAD disclosure; F1000 archived; audit reports added
</commit_message>
<xml_diff>
--- a/PLOS_CompBio_Draft_Chintala_v1_redline.docx
+++ b/PLOS_CompBio_Draft_Chintala_v1_redline.docx
@@ -117,16 +117,26 @@
           <w:sz w:val="24"/>
           <w:szCs w:val="24"/>
         </w:rPr>
-        <w:t xml:space="preserve">High-grade serous ovarian cancer (HGSOC) is the most lethal gynecologic malignancy, and resistance to platinum-based chemotherapy is a central driver of poor outcomes. Machine learning models trained on The Cancer Genome Atlas (TCGA) ovarian cancer cohort have repeatedly reported high predictive accuracy for platinum response, but the methodological rigor underlying these claims is rarely interrogated directly. Here we show that a substantial fraction of reported performance in this literature is attributable to feature-selection leakage: supervised gene selection performed prior to train/test splitting inflated area under the receiver operating characteristic curve (AUC) by a mean of +0.22 (up to +0.55) relative to unsupervised, leakage-free selection, a pattern that replicated across three independent TCGA cancer types (ovarian, lung adenocarcinoma, and colorectal). We further show that the overall-survival-threshold labels commonly used as a proxy for platinum response fail to recover confirmed non-responders (0/5 recall), and that classifiers trained on TCGA RNA-seq data do not generalize to an independent microarray cohort (AUC ≈ 0.5), a failure attributable to platform-level distributional incompatibility rather than model or feature choice.</w:t>
-      </w:r>
-      <w:ins w:id="2503" w:author="Cowork-audit" w:date="2026-08-20T00:00:00Z">
+        <w:t xml:space="preserve">High-grade serous ovarian cancer (HGSOC) is the most lethal gynecologic malignancy, and resistance to platinum-based chemotherapy is a central driver of poor outcomes. Machine learning models trained on The Cancer Genome Atlas (TCGA) ovarian cancer cohort have repeatedly reported high predictive accuracy for platinum response, but the methodological rigor underlying these claims is rarely interrogated directly. Here we show that a substantial fraction of reported performance in this literature is attributable to feature-selection leakage: supervised gene selection performed prior to train/test splitting inflated area under the receiver operating characteristic curve (AUC) by a mean of +0.22 (up to +0.55) relative to unsupervised, leakage-free selection, a pattern that replicated across three independent TCGA cancer types (ovarian, lung adenocarcinoma, and colorectal). We further show that the overall-survival-threshold labels commonly used as a proxy for platinum response fail to recover confirmed non-responders (0/5 recall), and that classifiers trained on TCGA RNA-seq data do not generalize to an independent microarray cohort (AUC ≈ 0.5), a failure attributable to platform-level distributional incompatibility rather than model or feature choice</w:t>
+      </w:r>
+      <w:del w:id="3001" w:author="Cowork-audit" w:date="2026-09-07T00:00:00Z">
         <w:r>
           <w:rPr>
             <w:rFonts w:ascii="Times New Roman" w:cs="Times New Roman" w:eastAsia="Times New Roman" w:hAnsi="Times New Roman"/>
             <w:sz w:val="24"/>
             <w:szCs w:val="24"/>
           </w:rPr>
-          <w:t xml:space="preserve"> [COWORK: AUTHOR DECISION - this "rather than feature choice" inference rests on the variance-ratio ~1.00 claim, whose computed value is 3.70x; re-argue or remove together with the Results sentence - author + Lockhart decision.]</w:t>
+          <w:delText xml:space="preserve">.</w:delText>
+        </w:r>
+      </w:del>
+      <w:ins w:id="3002" w:author="Cowork-audit" w:date="2026-09-07T00:00:00Z">
+        <w:r>
+          <w:rPr>
+            <w:rFonts w:ascii="Times New Roman" w:cs="Times New Roman" w:eastAsia="Times New Roman" w:hAnsi="Times New Roman"/>
+            <w:sz w:val="24"/>
+            <w:szCs w:val="24"/>
+          </w:rPr>
+          <w:t xml:space="preserve">: the selected genes retained their high-variance character in the validation cohort, yet the classifiers still performed at chance.</w:t>
         </w:r>
       </w:ins>
       <w:r>
@@ -338,76 +348,124 @@
           <w:sz w:val="24"/>
           <w:szCs w:val="24"/>
         </w:rPr>
-        <w:t xml:space="preserve">To quantify feature-selection leakage, we compared model performance under two feature-selection conditions: (i) unsupervised variance-based selection of the top 500 genes, computed independently within each training fold, and (ii) supervised F-score (ANOVA) selection of the top 500 genes, computed on the full dataset prior to splitting — a leakage-inducing but not uncommon practice in the applied literature. Logistic regression, random forest, and support vector machine (RBF kernel) classifiers were evaluated under both conditions across 30 repeated random splits per model and time threshold. To test whether this pattern was specific to ovarian cancer, the identical ablation pipeline was applied, without modification, to two additional TCGA PanCancer Atlas 2018 cohorts: lung adenocarcinoma (LUAD) and colorectal adenocarcinoma (COADREAD, platinum defined as oxaliplatin-containing FOLFOX regimens).</w:t>
-      </w:r>
-    </w:p>
-    <w:p>
-      <w:pPr>
-        <w:pStyle w:val="Heading2"/>
-        <w:spacing w:after="150" w:before="300"/>
-      </w:pPr>
-      <w:r>
-        <w:rPr>
-          <w:rFonts w:ascii="Times New Roman" w:cs="Times New Roman" w:eastAsia="Times New Roman" w:hAnsi="Times New Roman"/>
-          <w:b/>
-          <w:bCs/>
-          <w:sz w:val="26"/>
-          <w:szCs w:val="26"/>
-        </w:rPr>
-        <w:t xml:space="preserve">Label construct validity</w:t>
-      </w:r>
-    </w:p>
-    <w:p>
-      <w:pPr>
-        <w:spacing w:after="200" w:line="360"/>
-        <w:jc w:val="both"/>
-      </w:pPr>
-      <w:r>
-        <w:rPr>
-          <w:rFonts w:ascii="Times New Roman" w:cs="Times New Roman" w:eastAsia="Times New Roman" w:hAnsi="Times New Roman"/>
-          <w:sz w:val="24"/>
-          <w:szCs w:val="24"/>
-        </w:rPr>
-        <w:t xml:space="preserve">We compared the directly annotated clinical variable PRIMARY_THERAPY_OUTCOME_SUCCESS against an overall-survival (OS) threshold proxy label (alive/censored beyond threshold = responder) at each of the three time thresholds. Proxy-label recall was evaluated specifically against the subset of patients with a confirmed Progressive Disease annotation, the clearest available ground truth for non-response.</w:t>
-      </w:r>
-    </w:p>
-    <w:p>
-      <w:pPr>
-        <w:pStyle w:val="Heading2"/>
-        <w:spacing w:after="150" w:before="300"/>
-      </w:pPr>
-      <w:r>
-        <w:rPr>
-          <w:rFonts w:ascii="Times New Roman" w:cs="Times New Roman" w:eastAsia="Times New Roman" w:hAnsi="Times New Roman"/>
-          <w:b/>
-          <w:bCs/>
-          <w:sz w:val="26"/>
-          <w:szCs w:val="26"/>
-        </w:rPr>
-        <w:t xml:space="preserve">External validation</w:t>
-      </w:r>
-    </w:p>
-    <w:p>
-      <w:pPr>
-        <w:spacing w:after="200" w:line="360"/>
-        <w:jc w:val="both"/>
-      </w:pPr>
-      <w:r>
-        <w:rPr>
-          <w:rFonts w:ascii="Times New Roman" w:cs="Times New Roman" w:eastAsia="Times New Roman" w:hAnsi="Times New Roman"/>
-          <w:sz w:val="24"/>
-          <w:szCs w:val="24"/>
-        </w:rPr>
-        <w:t xml:space="preserve">Independent validation used GSE63885 [11], a microarray cohort (Affymetrix HG-U133 Plus 2.0, GPL570) of 101 ovarian cancer patients with clinical response (CR/PR vs. SD/PD) and disease-free-survival(DFS)-threshold labels. Probes were mapped to gene symbols, and platform harmonization with TCGA RNA-seq was performed via ComBat batch correction (sva package [17]) treating platform as the batch variable. Classifiers trained on TCGA data were applied directly to the harmonized GEO expression matrix. To distinguish feature-selection from platform-level explanations for any validation failure, we additionally compared the variance of TCGA's selected genes to the variance of all genes within the GEO dataset itself, and computed the post-ComBat Pearson correlation between platform-matched samples.</w:t>
-      </w:r>
-      <w:ins w:id="2504" w:author="Cowork-audit" w:date="2026-08-20T00:00:00Z">
+        <w:t xml:space="preserve">To quantify feature-selection leakage, we compared model performance under two feature-selection conditions: (i) unsupervised variance-based selection of the top 500 genes, computed independently within each training fold, and (ii) supervised F-score (ANOVA) selection of the top 500 genes, computed on the full dataset prior to splitting — a leakage-inducing but not uncommon practice in the applied literature. Logistic regression, random forest, and support vector machine (RBF kernel) classifiers were evaluated under both conditions across 30 repeated random splits per model and time threshold. To test whether this pattern was specific to ovarian cancer, the identical ablation pipeline </w:t>
+      </w:r>
+      <w:del w:id="3501" w:author="Cowork-audit" w:date="2026-09-07T00:00:00Z">
         <w:r>
           <w:rPr>
             <w:rFonts w:ascii="Times New Roman" w:cs="Times New Roman" w:eastAsia="Times New Roman" w:hAnsi="Times New Roman"/>
             <w:sz w:val="24"/>
             <w:szCs w:val="24"/>
           </w:rPr>
-          <w:t xml:space="preserve"> [COWORK: AUTHOR DECISION - the variance comparison described here yields 3.70x, not the ~1.00 reported in Results; see validation/outputs/combat_diagnostics.csv. Methods text and Results claim must be reconciled - author + Lockhart decision.]</w:t>
+          <w:delText xml:space="preserve">was applied, without modification, </w:delText>
+        </w:r>
+      </w:del>
+      <w:ins w:id="3502" w:author="Cowork-audit" w:date="2026-09-07T00:00:00Z">
+        <w:r>
+          <w:rPr>
+            <w:rFonts w:ascii="Times New Roman" w:cs="Times New Roman" w:eastAsia="Times New Roman" w:hAnsi="Times New Roman"/>
+            <w:sz w:val="24"/>
+            <w:szCs w:val="24"/>
+          </w:rPr>
+          <w:t xml:space="preserve">was applied unchanged, except for the survival thresholds used in the colorectal cohort, </w:t>
+        </w:r>
+      </w:ins>
+      <w:r>
+        <w:rPr>
+          <w:rFonts w:ascii="Times New Roman" w:cs="Times New Roman" w:eastAsia="Times New Roman" w:hAnsi="Times New Roman"/>
+          <w:sz w:val="24"/>
+          <w:szCs w:val="24"/>
+        </w:rPr>
+        <w:t xml:space="preserve">to two additional TCGA PanCancer Atlas 2018 cohorts: lung adenocarcinoma (LUAD) and colorectal adenocarcinoma (COADREAD, platinum defined as oxaliplatin-containing FOLFOX regimens).</w:t>
+      </w:r>
+      <w:ins w:id="3503" w:author="Cowork-audit" w:date="2026-09-07T00:00:00Z">
+        <w:r>
+          <w:rPr>
+            <w:rFonts w:ascii="Times New Roman" w:cs="Times New Roman" w:eastAsia="Times New Roman" w:hAnsi="Times New Roman"/>
+            <w:sz w:val="24"/>
+            <w:szCs w:val="24"/>
+          </w:rPr>
+          <w:t xml:space="preserve"> For COADREAD, thresholds of 18, 24, and 36 months were used in place of 12, 18, and 24 months.</w:t>
+        </w:r>
+      </w:ins>
+    </w:p>
+    <w:p>
+      <w:pPr>
+        <w:pStyle w:val="Heading2"/>
+        <w:spacing w:after="150" w:before="300"/>
+      </w:pPr>
+      <w:r>
+        <w:rPr>
+          <w:rFonts w:ascii="Times New Roman" w:cs="Times New Roman" w:eastAsia="Times New Roman" w:hAnsi="Times New Roman"/>
+          <w:b/>
+          <w:bCs/>
+          <w:sz w:val="26"/>
+          <w:szCs w:val="26"/>
+        </w:rPr>
+        <w:t xml:space="preserve">Label construct validity</w:t>
+      </w:r>
+    </w:p>
+    <w:p>
+      <w:pPr>
+        <w:spacing w:after="200" w:line="360"/>
+        <w:jc w:val="both"/>
+      </w:pPr>
+      <w:r>
+        <w:rPr>
+          <w:rFonts w:ascii="Times New Roman" w:cs="Times New Roman" w:eastAsia="Times New Roman" w:hAnsi="Times New Roman"/>
+          <w:sz w:val="24"/>
+          <w:szCs w:val="24"/>
+        </w:rPr>
+        <w:t xml:space="preserve">We compared the directly annotated clinical variable PRIMARY_THERAPY_OUTCOME_SUCCESS against an overall-survival (OS) threshold proxy label (alive/censored beyond threshold = responder) at each of the three time thresholds. Proxy-label recall was evaluated specifically against the subset of patients with a confirmed Progressive Disease annotation, the clearest available ground truth for non-response.</w:t>
+      </w:r>
+    </w:p>
+    <w:p>
+      <w:pPr>
+        <w:pStyle w:val="Heading2"/>
+        <w:spacing w:after="150" w:before="300"/>
+      </w:pPr>
+      <w:r>
+        <w:rPr>
+          <w:rFonts w:ascii="Times New Roman" w:cs="Times New Roman" w:eastAsia="Times New Roman" w:hAnsi="Times New Roman"/>
+          <w:b/>
+          <w:bCs/>
+          <w:sz w:val="26"/>
+          <w:szCs w:val="26"/>
+        </w:rPr>
+        <w:t xml:space="preserve">External validation</w:t>
+      </w:r>
+    </w:p>
+    <w:p>
+      <w:pPr>
+        <w:spacing w:after="200" w:line="360"/>
+        <w:jc w:val="both"/>
+      </w:pPr>
+      <w:r>
+        <w:rPr>
+          <w:rFonts w:ascii="Times New Roman" w:cs="Times New Roman" w:eastAsia="Times New Roman" w:hAnsi="Times New Roman"/>
+          <w:sz w:val="24"/>
+          <w:szCs w:val="24"/>
+        </w:rPr>
+        <w:t xml:space="preserve">Independent validation used GSE63885 [11], a microarray cohort (Affymetrix HG-U133 Plus 2.0, GPL570) of 101 ovarian cancer patients with clinical response (CR/PR vs. SD/PD) and disease-free-survival(DFS)-threshold labels. Probes were mapped to gene symbols, and platform harmonization with TCGA RNA-seq was performed via ComBat batch correction (sva package [17]) treating platform as the batch variable. Classifiers trained on TCGA data were applied directly to the harmonized GEO expression matrix. To distinguish feature-selection from platform-level explanations for any validation failure, we additionally compared</w:t>
+      </w:r>
+      <w:del w:id="3003" w:author="Cowork-audit" w:date="2026-09-07T00:00:00Z">
+        <w:r>
+          <w:rPr>
+            <w:rFonts w:ascii="Times New Roman" w:cs="Times New Roman" w:eastAsia="Times New Roman" w:hAnsi="Times New Roman"/>
+            <w:sz w:val="24"/>
+            <w:szCs w:val="24"/>
+          </w:rPr>
+          <w:delText xml:space="preserve"> the variance of TCGA's selected genes to the variance of all genes within the GEO dataset itself, and computed the post-ComBat Pearson correlation between platform-matched samples.</w:delText>
+        </w:r>
+      </w:del>
+      <w:ins w:id="3004" w:author="Cowork-audit" w:date="2026-09-07T00:00:00Z">
+        <w:r>
+          <w:rPr>
+            <w:rFonts w:ascii="Times New Roman" w:cs="Times New Roman" w:eastAsia="Times New Roman" w:hAnsi="Times New Roman"/>
+            <w:sz w:val="24"/>
+            <w:szCs w:val="24"/>
+          </w:rPr>
+          <w:t xml:space="preserve"> the mean variance of TCGA's 500 selected genes to the mean variance of all 15,994 genes common to both platforms, both measured within the GEO dataset itself, and computed the post-ComBat Pearson correlation between platform-matched samples.</w:t>
         </w:r>
       </w:ins>
       <w:r>
@@ -1103,8 +1161,38 @@
           <w:sz w:val="24"/>
           <w:szCs w:val="24"/>
         </w:rPr>
-        <w:t xml:space="preserve">All classifiers evaluated on the independent GSE63885 microarray cohort achieved near-chance AUC (≈ 0.5) on both the clinical-response and DFS-threshold label sets. We ruled out feature selection as the cause of this failure: the variance of TCGA's selected 500 genes within the GEO dataset was statistically indistinguishable from the variance of all genes in that dataset (ratio 1.00</w:t>
-      </w:r>
+        <w:t xml:space="preserve">All classifiers evaluated on the independent GSE63885 microarray cohort achieved near-chance AUC (≈ 0.5) on both the clinical-response and DFS-threshold label sets. </w:t>
+      </w:r>
+      <w:del w:id="3101" w:author="Cowork-audit" w:date="2026-09-07T00:00:00Z">
+        <w:r>
+          <w:rPr>
+            <w:rFonts w:ascii="Times New Roman" w:cs="Times New Roman" w:eastAsia="Times New Roman" w:hAnsi="Times New Roman"/>
+            <w:sz w:val="24"/>
+            <w:szCs w:val="24"/>
+          </w:rPr>
+          <w:delText xml:space="preserve">We ruled out feature selection as the cause of this failure:</w:delText>
+        </w:r>
+      </w:del>
+      <w:del w:id="3005" w:author="Cowork-audit" w:date="2026-09-07T00:00:00Z">
+        <w:r>
+          <w:rPr>
+            <w:rFonts w:ascii="Times New Roman" w:cs="Times New Roman" w:eastAsia="Times New Roman" w:hAnsi="Times New Roman"/>
+            <w:sz w:val="24"/>
+            <w:szCs w:val="24"/>
+          </w:rPr>
+          <w:delText xml:space="preserve"> the variance of TCGA's selected 500 genes within the GEO dataset was statistically indistinguishable from the variance of all genes in that dataset (ratio 1.00</w:delText>
+        </w:r>
+      </w:del>
+      <w:ins w:id="3102" w:author="Cowork-audit" w:date="2026-09-07T00:00:00Z">
+        <w:r>
+          <w:rPr>
+            <w:rFonts w:ascii="Times New Roman" w:cs="Times New Roman" w:eastAsia="Times New Roman" w:hAnsi="Times New Roman"/>
+            <w:sz w:val="24"/>
+            <w:szCs w:val="24"/>
+          </w:rPr>
+          <w:t xml:space="preserve"> The feature set itself transferred as intended: TCGA's 500 variance-selected genes remained high-variance within the GEO dataset (mean variance 1.066 vs. 0.288 for all 15,994 common genes; ratio 3.70x), so a degenerate or non-transferring gene set does not account for the failure.</w:t>
+        </w:r>
+      </w:ins>
       <w:ins w:id="1026" w:author="Cowork-audit" w:date="2026-07-20T00:00:00Z">
         <w:del w:id="2501" w:author="Cowork-audit" w:date="2026-08-20T00:00:00Z">
           <w:r>
@@ -1117,23 +1205,23 @@
           </w:r>
         </w:del>
       </w:ins>
-      <w:ins w:id="2502" w:author="Cowork-audit" w:date="2026-08-20T00:00:00Z">
+      <w:del w:id="3007" w:author="Cowork-audit" w:date="2026-09-07T00:00:00Z">
         <w:r>
           <w:rPr>
             <w:rFonts w:ascii="Times New Roman" w:cs="Times New Roman" w:eastAsia="Times New Roman" w:hAnsi="Times New Roman"/>
             <w:sz w:val="24"/>
             <w:szCs w:val="24"/>
           </w:rPr>
-          <w:t xml:space="preserve"> [COWORK: AUTHOR DECISION - computed value is 3.70x (validation/outputs/combat_diagnostics.csv, geo_variance_ratio_tcga_top500_vs_all = 3.7039); the ~1.00 figure had no code behind it and must be re-argued or removed - author + Lockhart decision. NOT resolved by Cowork.]</w:t>
+          <w:delText xml:space="preserve">). </w:delText>
         </w:r>
-      </w:ins>
-      <w:r>
-        <w:rPr>
-          <w:rFonts w:ascii="Times New Roman" w:cs="Times New Roman" w:eastAsia="Times New Roman" w:hAnsi="Times New Roman"/>
-          <w:sz w:val="24"/>
-          <w:szCs w:val="24"/>
-        </w:rPr>
-        <w:t xml:space="preserve">). Instead, the post-ComBat Pearson correlation between the two platforms was effectively zero (r = </w:t>
+      </w:del>
+      <w:r>
+        <w:rPr>
+          <w:rFonts w:ascii="Times New Roman" w:cs="Times New Roman" w:eastAsia="Times New Roman" w:hAnsi="Times New Roman"/>
+          <w:sz w:val="24"/>
+          <w:szCs w:val="24"/>
+        </w:rPr>
+        <w:t xml:space="preserve">Instead, the post-ComBat Pearson correlation between the two platforms was effectively zero (r = </w:t>
       </w:r>
       <w:del w:id="2016" w:author="Cowork-audit" w:date="2026-08-20T00:00:00Z">
         <w:r>
@@ -1915,7 +2003,53 @@
           <w:sz w:val="24"/>
           <w:szCs w:val="24"/>
         </w:rPr>
-        <w:t xml:space="preserve">Pathway enrichment of the resulting gene rankings identified two consistent biological themes. An epithelial–mesenchymal transition (EMT) / extracellular matrix (ECM) signature (MSigDB Hallmark EMT, KEGG ECM-receptor interaction, KEGG Focal adhesion) was significant at every gene-list size tested (top 50 through top 500), under every importance method, and irrespective of whether the unstable 12-month threshold model was included in the cross-threshold average — the most robust finding in this study, and consistent with EMT's established role as a platinum-resistance mechanism in HGSOC [18,19]. Core genes CTNNB1 and THBS2 were robust anchors of this signature across all conditions tested; COL1A1 contributed strongly only when the unstable 12-month model was included, and FLNA did not rank as important under any method or condition tested</w:t>
+        <w:t xml:space="preserve">Pathway enrichment of the resulting gene rankings identified two consistent biological themes. An epithelial–mesenchymal transition (EMT) / extracellular matrix (ECM) signature (MSigDB Hallmark EMT, KEGG ECM-receptor interaction, KEGG Focal adhesion) was significant at every gene-list size tested (top 50 through top 500), under every importance method, and irrespective of whether the unstable 12-month threshold model was included in the cross-threshold average — the most robust finding in this study, and consistent with EMT's established role as a platinum-resistance mechanism in HGSOC [18,19]. Core genes </w:t>
+      </w:r>
+      <w:del w:id="3201" w:author="Cowork-audit" w:date="2026-09-07T00:00:00Z">
+        <w:r>
+          <w:rPr>
+            <w:rFonts w:ascii="Times New Roman" w:cs="Times New Roman" w:eastAsia="Times New Roman" w:hAnsi="Times New Roman"/>
+            <w:sz w:val="24"/>
+            <w:szCs w:val="24"/>
+          </w:rPr>
+          <w:delText xml:space="preserve">CTNNB1 and THBS2 were robust anchors of this signature across all conditions tested; </w:delText>
+        </w:r>
+      </w:del>
+      <w:ins w:id="3202" w:author="Cowork-audit" w:date="2026-09-07T00:00:00Z">
+        <w:r>
+          <w:rPr>
+            <w:rFonts w:ascii="Times New Roman" w:cs="Times New Roman" w:eastAsia="Times New Roman" w:hAnsi="Times New Roman"/>
+            <w:sz w:val="24"/>
+            <w:szCs w:val="24"/>
+          </w:rPr>
+          <w:t xml:space="preserve">CTNNB1 and THBS2 were the most persistent members of this signature, appearing in 22-23 and 20-23 of 25 cross-validation folds respectively, and ranking 72nd and 69th among the top 200 SHAP-ranked genes with the unstable 12-month threshold excluded. </w:t>
+        </w:r>
+      </w:ins>
+      <w:r>
+        <w:rPr>
+          <w:rFonts w:ascii="Times New Roman" w:cs="Times New Roman" w:eastAsia="Times New Roman" w:hAnsi="Times New Roman"/>
+          <w:sz w:val="24"/>
+          <w:szCs w:val="24"/>
+        </w:rPr>
+        <w:t xml:space="preserve">COL1A1 contributed strongly only when the unstable 12-month model was included, and FLNA</w:t>
+      </w:r>
+      <w:ins w:id="3401" w:author="Cowork-audit" w:date="2026-09-07T00:00:00Z">
+        <w:r>
+          <w:rPr>
+            <w:rFonts w:ascii="Times New Roman" w:cs="Times New Roman" w:eastAsia="Times New Roman" w:hAnsi="Times New Roman"/>
+            <w:sz w:val="24"/>
+            <w:szCs w:val="24"/>
+          </w:rPr>
+          <w:t xml:space="preserve">, despite being detected in all 25 cross-validation folds at every threshold,</w:t>
+        </w:r>
+      </w:ins>
+      <w:r>
+        <w:rPr>
+          <w:rFonts w:ascii="Times New Roman" w:cs="Times New Roman" w:eastAsia="Times New Roman" w:hAnsi="Times New Roman"/>
+          <w:sz w:val="24"/>
+          <w:szCs w:val="24"/>
+        </w:rPr>
+        <w:t xml:space="preserve"> did not rank as important under any method or condition tested</w:t>
       </w:r>
       <w:ins w:id="1021" w:author="Cowork-audit" w:date="2026-07-20T00:00:00Z">
         <w:r>
@@ -1941,22 +2075,51 @@
         <w:spacing w:after="200" w:line="360"/>
         <w:jc w:val="both"/>
       </w:pPr>
-      <w:r>
-        <w:rPr>
-          <w:rFonts w:ascii="Times New Roman" w:cs="Times New Roman" w:eastAsia="Times New Roman" w:hAnsi="Times New Roman"/>
-          <w:sz w:val="24"/>
-          <w:szCs w:val="24"/>
-        </w:rPr>
-        <w:t xml:space="preserve">A second theme, ribosomal/translation gene enrichment (KEGG Ribosome and related Reactome/GO terms), was not robust under SHAP-based ranking at small gene-list sizes (not significant at the top 50 or top 100 genes) and only reached significance from a gene-list size of 200 onward</w:t>
-      </w:r>
-      <w:ins w:id="1022" w:author="Cowork-audit" w:date="2026-07-20T00:00:00Z">
+      <w:del w:id="3301" w:author="Cowork-audit" w:date="2026-09-07T00:00:00Z">
         <w:r>
           <w:rPr>
             <w:rFonts w:ascii="Times New Roman" w:cs="Times New Roman" w:eastAsia="Times New Roman" w:hAnsi="Times New Roman"/>
             <w:sz w:val="24"/>
             <w:szCs w:val="24"/>
           </w:rPr>
-          <w:t xml:space="preserve"> (under the 12-month-inclusive SHAP ranking; without the 12-month threshold the ribosomal theme is already significant at the top 100 genes, adj p=0.020) [COWORK: confirm framing — state which 12-month condition the paper should present; see fixes/phase4_corrected_values.csv]</w:t>
+          <w:delText xml:space="preserve">A second theme, ribosomal/translation gene enrichment (KEGG Ribosome and related Reactome/GO terms), was not robust under SHAP-based ranking at small gene-list sizes (not significant at the top 50 or top 100 genes) and only reached significance from a gene-list size of 200 onward</w:delText>
+        </w:r>
+      </w:del>
+      <w:del w:id="3302" w:author="Cowork-audit" w:date="2026-09-07T00:00:00Z">
+        <w:r>
+          <w:rPr>
+            <w:rFonts w:ascii="Times New Roman" w:cs="Times New Roman" w:eastAsia="Times New Roman" w:hAnsi="Times New Roman"/>
+            <w:sz w:val="24"/>
+            <w:szCs w:val="24"/>
+          </w:rPr>
+          <w:delText xml:space="preserve"> — a marked change from the original MDI-based analysis, in which this theme was already significant at 100 genes.</w:delText>
+        </w:r>
+      </w:del>
+      <w:ins w:id="3303" w:author="Cowork-audit" w:date="2026-09-07T00:00:00Z">
+        <w:r>
+          <w:rPr>
+            <w:rFonts w:ascii="Times New Roman" w:cs="Times New Roman" w:eastAsia="Times New Roman" w:hAnsi="Times New Roman"/>
+            <w:sz w:val="24"/>
+            <w:szCs w:val="24"/>
+          </w:rPr>
+          <w:t xml:space="preserve">A second theme, ribosomal/translation gene enrichment (KEGG Ribosome and related Reactome/GO terms), was sensitive to gene-list size under SHAP-based ranking. Under the 12-month-excluded ranking used throughout our importance analysis, the theme was not significant at the top 50 genes (adjusted p = 0.382) but reached significance by the top 100 (adjusted p = 0.020). Including the unstable 12-month threshold as a sensitivity check delayed significance further: the theme remained non-significant at both 50 and 100 genes (adjusted p = 0.371 and 0.305) and only reached significance at a gene-list size of 200 (adjusted p = 5.75 × 10</w:t>
+        </w:r>
+        <w:r>
+          <w:rPr>
+            <w:rFonts w:ascii="Times New Roman" w:cs="Times New Roman" w:eastAsia="Times New Roman" w:hAnsi="Times New Roman"/>
+            <w:sz w:val="24"/>
+            <w:szCs w:val="24"/>
+            <w:vertAlign w:val="superscript"/>
+          </w:rPr>
+          <w:t xml:space="preserve">−10</w:t>
+        </w:r>
+        <w:r>
+          <w:rPr>
+            <w:rFonts w:ascii="Times New Roman" w:cs="Times New Roman" w:eastAsia="Times New Roman" w:hAnsi="Times New Roman"/>
+            <w:sz w:val="24"/>
+            <w:szCs w:val="24"/>
+          </w:rPr>
+          <w:t xml:space="preserve">). Either way, this is a marked change from the original MDI-based analysis, in which this theme was already significant at 100 genes.</w:t>
         </w:r>
       </w:ins>
       <w:r>
@@ -1965,7 +2128,7 @@
           <w:sz w:val="24"/>
           <w:szCs w:val="24"/>
         </w:rPr>
-        <w:t xml:space="preserve"> — a marked change from the original MDI-based analysis, in which this theme was already significant at 100 genes. Purity-residualized re-analysis (above) also did not attenuate this signal; if anything, enrichment strength increased slightly after purity correction. We therefore regard the biological driver of the ribosomal signal as an open, unresolved question, for two independent reasons: it is not explained by tumor cellularity, and its statistical detectability under a less biased importance method is itself gene-list-size dependent. Plausible alternative explanations, not evaluated here, include tumor proliferation rate and RNA integrity.</w:t>
+        <w:t xml:space="preserve"> Purity-residualized re-analysis (above) also did not attenuate this signal; if anything, enrichment strength increased slightly after purity correction. We therefore regard the biological driver of the ribosomal signal as an open, unresolved question, for two independent reasons: it is not explained by tumor cellularity, and its statistical detectability under a less biased importance method is itself gene-list-size dependent. Plausible alternative explanations, not evaluated here, include tumor proliferation rate and RNA integrity.</w:t>
       </w:r>
     </w:p>
     <w:p>

</xml_diff>